<commit_message>
Close to MVP version
</commit_message>
<xml_diff>
--- a/SyncUp.docx
+++ b/SyncUp.docx
@@ -1,6 +1,6 @@
 
 <file path=word/document.xml><?xml version="1.0" encoding="utf-8"?>
-<w:document xmlns:wpc="http://schemas.microsoft.com/office/word/2010/wordprocessingCanvas" xmlns:cx="http://schemas.microsoft.com/office/drawing/2014/chartex" xmlns:cx1="http://schemas.microsoft.com/office/drawing/2015/9/8/chartex" xmlns:cx2="http://schemas.microsoft.com/office/drawing/2015/10/21/chartex" xmlns:cx3="http://schemas.microsoft.com/office/drawing/2016/5/9/chartex" xmlns:cx4="http://schemas.microsoft.com/office/drawing/2016/5/10/chartex" xmlns:cx5="http://schemas.microsoft.com/office/drawing/2016/5/11/chartex" xmlns:cx6="http://schemas.microsoft.com/office/drawing/2016/5/12/chartex" xmlns:cx7="http://schemas.microsoft.com/office/drawing/2016/5/13/chartex" xmlns:cx8="http://schemas.microsoft.com/office/drawing/2016/5/14/chartex" xmlns:mc="http://schemas.openxmlformats.org/markup-compatibility/2006" xmlns:aink="http://schemas.microsoft.com/office/drawing/2016/ink" xmlns:am3d="http://schemas.microsoft.com/office/drawing/2017/model3d" xmlns:o="urn:schemas-microsoft-com:office:office" xmlns:oel="http://schemas.microsoft.com/office/2019/extlst" xmlns:r="http://schemas.openxmlformats.org/officeDocument/2006/relationships" xmlns:m="http://schemas.openxmlformats.org/officeDocument/2006/math" xmlns:v="urn:schemas-microsoft-com:vml" xmlns:wp14="http://schemas.microsoft.com/office/word/2010/wordprocessingDrawing" xmlns:wp="http://schemas.openxmlformats.org/drawingml/2006/wordprocessingDrawing" xmlns:w10="urn:schemas-microsoft-com:office:word" xmlns:w="http://schemas.openxmlformats.org/wordprocessingml/2006/main" xmlns:w14="http://schemas.microsoft.com/office/word/2010/wordml" xmlns:w15="http://schemas.microsoft.com/office/word/2012/wordml" xmlns:w16cex="http://schemas.microsoft.com/office/word/2018/wordml/cex" xmlns:w16cid="http://schemas.microsoft.com/office/word/2016/wordml/cid" xmlns:w16="http://schemas.microsoft.com/office/word/2018/wordml" xmlns:w16du="http://schemas.microsoft.com/office/word/2023/wordml/word16du" xmlns:w16sdtdh="http://schemas.microsoft.com/office/word/2020/wordml/sdtdatahash" xmlns:w16sdtfl="http://schemas.microsoft.com/office/word/2024/wordml/sdtformatlock" xmlns:w16se="http://schemas.microsoft.com/office/word/2015/wordml/symex" xmlns:wpg="http://schemas.microsoft.com/office/word/2010/wordprocessingGroup" xmlns:wpi="http://schemas.microsoft.com/office/word/2010/wordprocessingInk" xmlns:wne="http://schemas.microsoft.com/office/word/2006/wordml" xmlns:wps="http://schemas.microsoft.com/office/word/2010/wordprocessingShape" mc:Ignorable="w14 w15 w16se w16cid w16 w16cex w16sdtdh w16sdtfl w16du wp14">
+<w:document xmlns:wpc="http://schemas.microsoft.com/office/word/2010/wordprocessingCanvas" xmlns:cx="http://schemas.microsoft.com/office/drawing/2014/chartex" xmlns:cx1="http://schemas.microsoft.com/office/drawing/2015/9/8/chartex" xmlns:cx2="http://schemas.microsoft.com/office/drawing/2015/10/21/chartex" xmlns:cx3="http://schemas.microsoft.com/office/drawing/2016/5/9/chartex" xmlns:cx4="http://schemas.microsoft.com/office/drawing/2016/5/10/chartex" xmlns:cx5="http://schemas.microsoft.com/office/drawing/2016/5/11/chartex" xmlns:cx6="http://schemas.microsoft.com/office/drawing/2016/5/12/chartex" xmlns:cx7="http://schemas.microsoft.com/office/drawing/2016/5/13/chartex" xmlns:cx8="http://schemas.microsoft.com/office/drawing/2016/5/14/chartex" xmlns:mc="http://schemas.openxmlformats.org/markup-compatibility/2006" xmlns:m="http://schemas.openxmlformats.org/officeDocument/2006/math" xmlns:aink="http://schemas.microsoft.com/office/drawing/2016/ink" xmlns:am3d="http://schemas.microsoft.com/office/drawing/2017/model3d" xmlns:oel="http://schemas.microsoft.com/office/2019/extlst" xmlns:r="http://schemas.openxmlformats.org/officeDocument/2006/relationships" xmlns:wp14="http://schemas.microsoft.com/office/word/2010/wordprocessingDrawing" xmlns:wp="http://schemas.openxmlformats.org/drawingml/2006/wordprocessingDrawing" xmlns:wpg="http://schemas.microsoft.com/office/word/2010/wordprocessingGroup" xmlns:wpi="http://schemas.microsoft.com/office/word/2010/wordprocessingInk" xmlns:wps="http://schemas.microsoft.com/office/word/2010/wordprocessingShape" xmlns:o="urn:schemas-microsoft-com:office:office" xmlns:v="urn:schemas-microsoft-com:vml" xmlns:w10="urn:schemas-microsoft-com:office:word" xmlns:w="http://schemas.openxmlformats.org/wordprocessingml/2006/main" xmlns:w14="http://schemas.microsoft.com/office/word/2010/wordml" xmlns:w15="http://schemas.microsoft.com/office/word/2012/wordml" xmlns:w16cex="http://schemas.microsoft.com/office/word/2018/wordml/cex" xmlns:w16cid="http://schemas.microsoft.com/office/word/2016/wordml/cid" xmlns:w16="http://schemas.microsoft.com/office/word/2018/wordml" xmlns:w16sdtdh="http://schemas.microsoft.com/office/word/2020/wordml/sdtdatahash" xmlns:w16sdtfl="http://schemas.microsoft.com/office/word/2024/wordml/sdtformatlock" xmlns:w16se="http://schemas.microsoft.com/office/word/2015/wordml/symex" xmlns:w16du="http://schemas.microsoft.com/office/word/2023/wordml/word16du" xmlns:wne="http://schemas.microsoft.com/office/word/2006/wordml" mc:Ignorable="w14 w15 w16se w16cid w16 w16cex w16sdtdh w16sdtfl w16du wp14">
   <w:body>
     <w:p>
       <w:pPr>
@@ -14,7 +14,6 @@
           <w:szCs w:val="40"/>
         </w:rPr>
       </w:pPr>
-      <w:proofErr w:type="spellStart"/>
       <w:r>
         <w:rPr>
           <w:rFonts w:ascii="Aptos" w:hAnsi="Aptos" w:cs="Times New Roman"/>
@@ -25,7 +24,6 @@
         </w:rPr>
         <w:t>SyncRadar</w:t>
       </w:r>
-      <w:proofErr w:type="spellEnd"/>
     </w:p>
     <w:tbl>
       <w:tblPr>
@@ -112,23 +110,7 @@
           <w:sz w:val="32"/>
           <w:szCs w:val="32"/>
         </w:rPr>
-        <w:t xml:space="preserve"> = </w:t>
-      </w:r>
-      <w:proofErr w:type="spellStart"/>
-      <w:r>
-        <w:rPr>
-          <w:sz w:val="32"/>
-          <w:szCs w:val="32"/>
-        </w:rPr>
-        <w:t>LiveMap</w:t>
-      </w:r>
-      <w:proofErr w:type="spellEnd"/>
-      <w:r>
-        <w:rPr>
-          <w:sz w:val="32"/>
-          <w:szCs w:val="32"/>
-        </w:rPr>
-        <w:t xml:space="preserve"> (Structured Hierarchy) </w:t>
+        <w:t xml:space="preserve"> = LiveMap (Structured Hierarchy) </w:t>
       </w:r>
       <w:r>
         <w:rPr>
@@ -186,15 +168,15 @@
       </w:pPr>
       <w:r>
         <w:rPr>
-          <w:rFonts w:ascii="Times New Roman" w:eastAsia="Times New Roman" w:hAnsi="Times New Roman" w:cs="Times New Roman"/>
           <w:noProof/>
-          <w:kern w:val="0"/>
-          <w:sz w:val="28"/>
-          <w:szCs w:val="28"/>
-          <w:lang w:eastAsia="en-GB" w:bidi="as-IN"/>
-        </w:rPr>
-        <w:pict w14:anchorId="0659B7C4">
-          <v:rect id="_x0000_i1034" alt="" style="width:451.3pt;height:.05pt;mso-width-percent:0;mso-height-percent:0;mso-width-percent:0;mso-height-percent:0" o:hralign="center" o:hrstd="t" o:hr="t" fillcolor="#a0a0a0" stroked="f"/>
+        </w:rPr>
+      </w:r>
+      <w:r>
+        <w:pict w14:anchorId="5A9AF21E">
+          <v:rect id="Horizontal Line 1" o:spid="_x0000_s1035" style="width:523.3pt;height:.05pt;visibility:visible;mso-wrap-style:square;mso-left-percent:-10001;mso-top-percent:-10001;mso-position-horizontal:absolute;mso-position-horizontal-relative:char;mso-position-vertical:absolute;mso-position-vertical-relative:line;mso-left-percent:-10001;mso-top-percent:-10001;v-text-anchor:top" o:gfxdata="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" filled="f">
+            <o:lock v:ext="edit" rotation="t" aspectratio="t" verticies="t" text="t" shapetype="t"/>
+            <w10:anchorlock/>
+          </v:rect>
         </w:pict>
       </w:r>
     </w:p>
@@ -226,7 +208,6 @@
         </w:rPr>
         <w:t xml:space="preserve">1. What Exactly Is </w:t>
       </w:r>
-      <w:proofErr w:type="spellStart"/>
       <w:r>
         <w:rPr>
           <w:rFonts w:ascii="Times New Roman" w:eastAsia="Times New Roman" w:hAnsi="Times New Roman" w:cs="Times New Roman"/>
@@ -238,9 +219,8 @@
           <w:lang w:eastAsia="en-GB" w:bidi="as-IN"/>
           <w14:ligatures w14:val="none"/>
         </w:rPr>
-        <w:t>SyncUp</w:t>
-      </w:r>
-      <w:proofErr w:type="spellEnd"/>
+        <w:t>Sync</w:t>
+      </w:r>
       <w:r>
         <w:rPr>
           <w:rFonts w:ascii="Times New Roman" w:eastAsia="Times New Roman" w:hAnsi="Times New Roman" w:cs="Times New Roman"/>
@@ -252,7 +232,20 @@
           <w:lang w:eastAsia="en-GB" w:bidi="as-IN"/>
           <w14:ligatures w14:val="none"/>
         </w:rPr>
-        <w:t xml:space="preserve"> Radar?</w:t>
+        <w:t>Radar</w:t>
+      </w:r>
+      <w:r>
+        <w:rPr>
+          <w:rFonts w:ascii="Times New Roman" w:eastAsia="Times New Roman" w:hAnsi="Times New Roman" w:cs="Times New Roman"/>
+          <w:b/>
+          <w:bCs/>
+          <w:kern w:val="0"/>
+          <w:sz w:val="28"/>
+          <w:szCs w:val="28"/>
+          <w:lang w:eastAsia="en-GB" w:bidi="as-IN"/>
+          <w14:ligatures w14:val="none"/>
+        </w:rPr>
+        <w:t>?</w:t>
       </w:r>
     </w:p>
     <w:p>
@@ -267,7 +260,6 @@
           <w14:ligatures w14:val="none"/>
         </w:rPr>
       </w:pPr>
-      <w:proofErr w:type="spellStart"/>
       <w:r>
         <w:rPr>
           <w:rFonts w:ascii="Times New Roman" w:eastAsia="Times New Roman" w:hAnsi="Times New Roman" w:cs="Times New Roman"/>
@@ -279,9 +271,8 @@
           <w:lang w:eastAsia="en-GB" w:bidi="as-IN"/>
           <w14:ligatures w14:val="none"/>
         </w:rPr>
-        <w:t>SyncUp</w:t>
-      </w:r>
-      <w:proofErr w:type="spellEnd"/>
+        <w:t>Sync</w:t>
+      </w:r>
       <w:r>
         <w:rPr>
           <w:rFonts w:ascii="Times New Roman" w:eastAsia="Times New Roman" w:hAnsi="Times New Roman" w:cs="Times New Roman"/>
@@ -293,7 +284,33 @@
           <w:lang w:eastAsia="en-GB" w:bidi="as-IN"/>
           <w14:ligatures w14:val="none"/>
         </w:rPr>
-        <w:t xml:space="preserve"> Radar is a real-time AI literacy engine.</w:t>
+        <w:t>Radar</w:t>
+      </w:r>
+      <w:r>
+        <w:rPr>
+          <w:rFonts w:ascii="Times New Roman" w:eastAsia="Times New Roman" w:hAnsi="Times New Roman" w:cs="Times New Roman"/>
+          <w:b/>
+          <w:bCs/>
+          <w:kern w:val="0"/>
+          <w:sz w:val="28"/>
+          <w:szCs w:val="28"/>
+          <w:lang w:eastAsia="en-GB" w:bidi="as-IN"/>
+          <w14:ligatures w14:val="none"/>
+        </w:rPr>
+        <w:t xml:space="preserve"> </w:t>
+      </w:r>
+      <w:r>
+        <w:rPr>
+          <w:rFonts w:ascii="Times New Roman" w:eastAsia="Times New Roman" w:hAnsi="Times New Roman" w:cs="Times New Roman"/>
+          <w:b/>
+          <w:bCs/>
+          <w:kern w:val="0"/>
+          <w:sz w:val="28"/>
+          <w:szCs w:val="28"/>
+          <w:lang w:eastAsia="en-GB" w:bidi="as-IN"/>
+          <w14:ligatures w14:val="none"/>
+        </w:rPr>
+        <w:t>Radar is a real-time AI literacy engine.</w:t>
       </w:r>
     </w:p>
     <w:p>
@@ -604,7 +621,6 @@
                 <w14:ligatures w14:val="none"/>
               </w:rPr>
             </w:pPr>
-            <w:proofErr w:type="spellStart"/>
             <w:r>
               <w:rPr>
                 <w:rFonts w:ascii="Times New Roman" w:eastAsia="Times New Roman" w:hAnsi="Times New Roman" w:cs="Times New Roman"/>
@@ -618,7 +634,6 @@
               </w:rPr>
               <w:t>LiveMap</w:t>
             </w:r>
-            <w:proofErr w:type="spellEnd"/>
           </w:p>
         </w:tc>
         <w:tc>
@@ -980,29 +995,53 @@
         </w:rPr>
         <w:t xml:space="preserve"> </w:t>
       </w:r>
-      <w:proofErr w:type="spellStart"/>
-      <w:r>
-        <w:rPr>
-          <w:rFonts w:ascii="Times New Roman" w:eastAsia="Times New Roman" w:hAnsi="Times New Roman" w:cs="Times New Roman"/>
-          <w:kern w:val="0"/>
-          <w:sz w:val="28"/>
-          <w:szCs w:val="28"/>
-          <w:lang w:eastAsia="en-GB" w:bidi="as-IN"/>
-          <w14:ligatures w14:val="none"/>
-        </w:rPr>
-        <w:t>SyncUp</w:t>
-      </w:r>
-      <w:proofErr w:type="spellEnd"/>
-      <w:r>
-        <w:rPr>
-          <w:rFonts w:ascii="Times New Roman" w:eastAsia="Times New Roman" w:hAnsi="Times New Roman" w:cs="Times New Roman"/>
-          <w:kern w:val="0"/>
-          <w:sz w:val="28"/>
-          <w:szCs w:val="28"/>
-          <w:lang w:eastAsia="en-GB" w:bidi="as-IN"/>
-          <w14:ligatures w14:val="none"/>
-        </w:rPr>
-        <w:t xml:space="preserve"> is where AI professionals go to find out what just changed in the industry — and learn it before everyone else does.</w:t>
+      <w:r>
+        <w:rPr>
+          <w:rFonts w:ascii="Times New Roman" w:eastAsia="Times New Roman" w:hAnsi="Times New Roman" w:cs="Times New Roman"/>
+          <w:b/>
+          <w:bCs/>
+          <w:kern w:val="0"/>
+          <w:sz w:val="28"/>
+          <w:szCs w:val="28"/>
+          <w:lang w:eastAsia="en-GB" w:bidi="as-IN"/>
+          <w14:ligatures w14:val="none"/>
+        </w:rPr>
+        <w:t>Sync</w:t>
+      </w:r>
+      <w:r>
+        <w:rPr>
+          <w:rFonts w:ascii="Times New Roman" w:eastAsia="Times New Roman" w:hAnsi="Times New Roman" w:cs="Times New Roman"/>
+          <w:b/>
+          <w:bCs/>
+          <w:kern w:val="0"/>
+          <w:sz w:val="28"/>
+          <w:szCs w:val="28"/>
+          <w:lang w:eastAsia="en-GB" w:bidi="as-IN"/>
+          <w14:ligatures w14:val="none"/>
+        </w:rPr>
+        <w:t>Radar</w:t>
+      </w:r>
+      <w:r>
+        <w:rPr>
+          <w:rFonts w:ascii="Times New Roman" w:eastAsia="Times New Roman" w:hAnsi="Times New Roman" w:cs="Times New Roman"/>
+          <w:kern w:val="0"/>
+          <w:sz w:val="28"/>
+          <w:szCs w:val="28"/>
+          <w:lang w:eastAsia="en-GB" w:bidi="as-IN"/>
+          <w14:ligatures w14:val="none"/>
+        </w:rPr>
+        <w:t xml:space="preserve"> </w:t>
+      </w:r>
+      <w:r>
+        <w:rPr>
+          <w:rFonts w:ascii="Times New Roman" w:eastAsia="Times New Roman" w:hAnsi="Times New Roman" w:cs="Times New Roman"/>
+          <w:kern w:val="0"/>
+          <w:sz w:val="28"/>
+          <w:szCs w:val="28"/>
+          <w:lang w:eastAsia="en-GB" w:bidi="as-IN"/>
+          <w14:ligatures w14:val="none"/>
+        </w:rPr>
+        <w:t>is where AI professionals go to find out what just changed in the industry — and learn it before everyone else does.</w:t>
       </w:r>
     </w:p>
     <w:p>
@@ -1018,15 +1057,15 @@
       </w:pPr>
       <w:r>
         <w:rPr>
-          <w:rFonts w:ascii="Times New Roman" w:eastAsia="Times New Roman" w:hAnsi="Times New Roman" w:cs="Times New Roman"/>
           <w:noProof/>
-          <w:kern w:val="0"/>
-          <w:sz w:val="28"/>
-          <w:szCs w:val="28"/>
-          <w:lang w:eastAsia="en-GB" w:bidi="as-IN"/>
-        </w:rPr>
-        <w:pict w14:anchorId="3AEB8CC8">
-          <v:rect id="_x0000_i1033" alt="" style="width:451.3pt;height:.05pt;mso-width-percent:0;mso-height-percent:0;mso-width-percent:0;mso-height-percent:0" o:hralign="center" o:hrstd="t" o:hr="t" fillcolor="#a0a0a0" stroked="f"/>
+        </w:rPr>
+      </w:r>
+      <w:r>
+        <w:pict w14:anchorId="306A058F">
+          <v:rect id="Horizontal Line 2" o:spid="_x0000_s1034" style="width:523.3pt;height:.05pt;visibility:visible;mso-wrap-style:square;mso-left-percent:-10001;mso-top-percent:-10001;mso-position-horizontal:absolute;mso-position-horizontal-relative:char;mso-position-vertical:absolute;mso-position-vertical-relative:line;mso-left-percent:-10001;mso-top-percent:-10001;v-text-anchor:top" o:gfxdata="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" filled="f">
+            <o:lock v:ext="edit" rotation="t" aspectratio="t" verticies="t" text="t" shapetype="t"/>
+            <w10:anchorlock/>
+          </v:rect>
         </w:pict>
       </w:r>
     </w:p>
@@ -1113,7 +1152,6 @@
         <w:t xml:space="preserve">Skills demanded by employers are changing 66% faster in AI-exposed occupations than in the least exposed roles. 39% of today's skill sets will become outdated or transformed between 2025 and 2030. </w:t>
       </w:r>
       <w:hyperlink r:id="rId5" w:tgtFrame="_blank" w:history="1">
-        <w:proofErr w:type="spellStart"/>
         <w:r>
           <w:rPr>
             <w:rFonts w:ascii="Times New Roman" w:eastAsia="Times New Roman" w:hAnsi="Times New Roman" w:cs="Times New Roman"/>
@@ -1142,7 +1180,6 @@
           </w:rPr>
           <w:t>Airadar</w:t>
         </w:r>
-        <w:proofErr w:type="spellEnd"/>
       </w:hyperlink>
     </w:p>
     <w:p>
@@ -1195,9 +1232,9 @@
         <w:tblLook w:val="04A0" w:firstRow="1" w:lastRow="0" w:firstColumn="1" w:lastColumn="0" w:noHBand="0" w:noVBand="1"/>
       </w:tblPr>
       <w:tblGrid>
-        <w:gridCol w:w="2486"/>
-        <w:gridCol w:w="3160"/>
-        <w:gridCol w:w="4820"/>
+        <w:gridCol w:w="2072"/>
+        <w:gridCol w:w="2424"/>
+        <w:gridCol w:w="5970"/>
       </w:tblGrid>
       <w:tr>
         <w:trPr>
@@ -1521,29 +1558,16 @@
                 <w14:ligatures w14:val="none"/>
               </w:rPr>
             </w:pPr>
-            <w:proofErr w:type="spellStart"/>
-            <w:r>
-              <w:rPr>
-                <w:rFonts w:ascii="Times New Roman" w:eastAsia="Times New Roman" w:hAnsi="Times New Roman" w:cs="Times New Roman"/>
-                <w:kern w:val="0"/>
-                <w:sz w:val="28"/>
-                <w:szCs w:val="28"/>
-                <w:lang w:eastAsia="en-GB" w:bidi="as-IN"/>
-                <w14:ligatures w14:val="none"/>
-              </w:rPr>
-              <w:t>AlphaSignal</w:t>
-            </w:r>
-            <w:proofErr w:type="spellEnd"/>
-            <w:r>
-              <w:rPr>
-                <w:rFonts w:ascii="Times New Roman" w:eastAsia="Times New Roman" w:hAnsi="Times New Roman" w:cs="Times New Roman"/>
-                <w:kern w:val="0"/>
-                <w:sz w:val="28"/>
-                <w:szCs w:val="28"/>
-                <w:lang w:eastAsia="en-GB" w:bidi="as-IN"/>
-                <w14:ligatures w14:val="none"/>
-              </w:rPr>
-              <w:t xml:space="preserve"> / TLDR AI</w:t>
+            <w:r>
+              <w:rPr>
+                <w:rFonts w:ascii="Times New Roman" w:eastAsia="Times New Roman" w:hAnsi="Times New Roman" w:cs="Times New Roman"/>
+                <w:kern w:val="0"/>
+                <w:sz w:val="28"/>
+                <w:szCs w:val="28"/>
+                <w:lang w:eastAsia="en-GB" w:bidi="as-IN"/>
+                <w14:ligatures w14:val="none"/>
+              </w:rPr>
+              <w:t>AlphaSignal / TLDR AI</w:t>
             </w:r>
           </w:p>
         </w:tc>
@@ -1603,7 +1627,7 @@
                 <w:lang w:eastAsia="en-GB" w:bidi="as-IN"/>
                 <w14:ligatures w14:val="none"/>
               </w:rPr>
-              <w:t>Doesn't teach it; you're on your own after reading</w:t>
+              <w:t>Like news articles. Don’t know about your background hence no personalization at concept level.</w:t>
             </w:r>
           </w:p>
         </w:tc>
@@ -1724,21 +1748,32 @@
                 <w14:ligatures w14:val="none"/>
               </w:rPr>
             </w:pPr>
-            <w:proofErr w:type="spellStart"/>
-            <w:r>
-              <w:rPr>
-                <w:rFonts w:ascii="Times New Roman" w:eastAsia="Times New Roman" w:hAnsi="Times New Roman" w:cs="Times New Roman"/>
-                <w:b/>
-                <w:bCs/>
-                <w:kern w:val="0"/>
-                <w:sz w:val="28"/>
-                <w:szCs w:val="28"/>
-                <w:lang w:eastAsia="en-GB" w:bidi="as-IN"/>
-                <w14:ligatures w14:val="none"/>
-              </w:rPr>
-              <w:t>SyncUp</w:t>
-            </w:r>
-            <w:proofErr w:type="spellEnd"/>
+            <w:r>
+              <w:rPr>
+                <w:rFonts w:ascii="Times New Roman" w:eastAsia="Times New Roman" w:hAnsi="Times New Roman" w:cs="Times New Roman"/>
+                <w:b/>
+                <w:bCs/>
+                <w:kern w:val="0"/>
+                <w:sz w:val="28"/>
+                <w:szCs w:val="28"/>
+                <w:lang w:eastAsia="en-GB" w:bidi="as-IN"/>
+                <w14:ligatures w14:val="none"/>
+              </w:rPr>
+              <w:t>Sync</w:t>
+            </w:r>
+            <w:r>
+              <w:rPr>
+                <w:rFonts w:ascii="Times New Roman" w:eastAsia="Times New Roman" w:hAnsi="Times New Roman" w:cs="Times New Roman"/>
+                <w:b/>
+                <w:bCs/>
+                <w:kern w:val="0"/>
+                <w:sz w:val="28"/>
+                <w:szCs w:val="28"/>
+                <w:lang w:eastAsia="en-GB" w:bidi="as-IN"/>
+                <w14:ligatures w14:val="none"/>
+              </w:rPr>
+              <w:t>Radar</w:t>
+            </w:r>
           </w:p>
         </w:tc>
         <w:tc>
@@ -1909,31 +1944,7 @@
           <w14:ligatures w14:val="none"/>
         </w:rPr>
         <w:br/>
-        <w:t xml:space="preserve">When someone does discover something new, the path to learning it is fragmented — paper is too dense, YouTube is too long, ChatGPT has no structure. </w:t>
-      </w:r>
-      <w:proofErr w:type="spellStart"/>
-      <w:r>
-        <w:rPr>
-          <w:rFonts w:ascii="Times New Roman" w:eastAsia="Times New Roman" w:hAnsi="Times New Roman" w:cs="Times New Roman"/>
-          <w:kern w:val="0"/>
-          <w:sz w:val="28"/>
-          <w:szCs w:val="28"/>
-          <w:lang w:eastAsia="en-GB" w:bidi="as-IN"/>
-          <w14:ligatures w14:val="none"/>
-        </w:rPr>
-        <w:t>SyncUp</w:t>
-      </w:r>
-      <w:proofErr w:type="spellEnd"/>
-      <w:r>
-        <w:rPr>
-          <w:rFonts w:ascii="Times New Roman" w:eastAsia="Times New Roman" w:hAnsi="Times New Roman" w:cs="Times New Roman"/>
-          <w:kern w:val="0"/>
-          <w:sz w:val="28"/>
-          <w:szCs w:val="28"/>
-          <w:lang w:eastAsia="en-GB" w:bidi="as-IN"/>
-          <w14:ligatures w14:val="none"/>
-        </w:rPr>
-        <w:t xml:space="preserve"> collapses discovery and learning into one step.</w:t>
+        <w:t>When someone does discover something new, the path to learning it is fragmented — paper is too dense, YouTube is too long, ChatGPT has no structure. SyncUp collapses discovery and learning into one step.</w:t>
       </w:r>
     </w:p>
     <w:p>
@@ -2580,6 +2591,7 @@
                 <w:lang w:eastAsia="en-GB" w:bidi="as-IN"/>
                 <w14:ligatures w14:val="none"/>
               </w:rPr>
+              <w:lastRenderedPageBreak/>
               <w:t>AI-curious Product and Business Professionals</w:t>
             </w:r>
           </w:p>
@@ -2824,11 +2836,9 @@
           <w:lang w:eastAsia="en-GB" w:bidi="as-IN"/>
           <w14:ligatures w14:val="none"/>
         </w:rPr>
-        <w:lastRenderedPageBreak/>
         <w:t xml:space="preserve">Four of LinkedIn's top five fastest-growing positions are AI-related, and AI/ML job postings have surged 163% from 2024 to 2025. 77% of employers plan to reskill or upskill their workforce to work effectively with AI tools. </w:t>
       </w:r>
       <w:hyperlink r:id="rId7" w:tgtFrame="_blank" w:history="1">
-        <w:proofErr w:type="spellStart"/>
         <w:r>
           <w:rPr>
             <w:rFonts w:ascii="Times New Roman" w:eastAsia="Times New Roman" w:hAnsi="Times New Roman" w:cs="Times New Roman"/>
@@ -2840,35 +2850,7 @@
             <w:lang w:eastAsia="en-GB" w:bidi="as-IN"/>
             <w14:ligatures w14:val="none"/>
           </w:rPr>
-          <w:t>Odys</w:t>
-        </w:r>
-        <w:proofErr w:type="spellEnd"/>
-        <w:r>
-          <w:rPr>
-            <w:rFonts w:ascii="Times New Roman" w:eastAsia="Times New Roman" w:hAnsi="Times New Roman" w:cs="Times New Roman"/>
-            <w:color w:val="0000FF"/>
-            <w:kern w:val="0"/>
-            <w:sz w:val="28"/>
-            <w:szCs w:val="28"/>
-            <w:u w:val="single"/>
-            <w:lang w:eastAsia="en-GB" w:bidi="as-IN"/>
-            <w14:ligatures w14:val="none"/>
-          </w:rPr>
-          <w:t xml:space="preserve"> </w:t>
-        </w:r>
-        <w:proofErr w:type="spellStart"/>
-        <w:r>
-          <w:rPr>
-            <w:rFonts w:ascii="Times New Roman" w:eastAsia="Times New Roman" w:hAnsi="Times New Roman" w:cs="Times New Roman"/>
-            <w:color w:val="0000FF"/>
-            <w:kern w:val="0"/>
-            <w:sz w:val="28"/>
-            <w:szCs w:val="28"/>
-            <w:u w:val="single"/>
-            <w:lang w:eastAsia="en-GB" w:bidi="as-IN"/>
-            <w14:ligatures w14:val="none"/>
-          </w:rPr>
-          <w:t>Global</w:t>
+          <w:t>Odys Global</w:t>
         </w:r>
       </w:hyperlink>
       <w:hyperlink r:id="rId8" w:tgtFrame="_blank" w:history="1">
@@ -2885,7 +2867,6 @@
           </w:rPr>
           <w:t>Airadar</w:t>
         </w:r>
-        <w:proofErr w:type="spellEnd"/>
       </w:hyperlink>
     </w:p>
     <w:p>
@@ -2901,15 +2882,15 @@
       </w:pPr>
       <w:r>
         <w:rPr>
-          <w:rFonts w:ascii="Times New Roman" w:eastAsia="Times New Roman" w:hAnsi="Times New Roman" w:cs="Times New Roman"/>
           <w:noProof/>
-          <w:kern w:val="0"/>
-          <w:sz w:val="28"/>
-          <w:szCs w:val="28"/>
-          <w:lang w:eastAsia="en-GB" w:bidi="as-IN"/>
-        </w:rPr>
-        <w:pict w14:anchorId="79849F6E">
-          <v:rect id="_x0000_i1032" alt="" style="width:451.3pt;height:.05pt;mso-width-percent:0;mso-height-percent:0;mso-width-percent:0;mso-height-percent:0" o:hralign="center" o:hrstd="t" o:hr="t" fillcolor="#a0a0a0" stroked="f"/>
+        </w:rPr>
+      </w:r>
+      <w:r>
+        <w:pict w14:anchorId="005DF706">
+          <v:rect id="Horizontal Line 3" o:spid="_x0000_s1033" style="width:523.3pt;height:.05pt;visibility:visible;mso-wrap-style:square;mso-left-percent:-10001;mso-top-percent:-10001;mso-position-horizontal:absolute;mso-position-horizontal-relative:char;mso-position-vertical:absolute;mso-position-vertical-relative:line;mso-left-percent:-10001;mso-top-percent:-10001;v-text-anchor:top" o:gfxdata="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" filled="f">
+            <o:lock v:ext="edit" rotation="t" aspectratio="t" verticies="t" text="t" shapetype="t"/>
+            <w10:anchorlock/>
+          </v:rect>
         </w:pict>
       </w:r>
     </w:p>
@@ -2941,7 +2922,6 @@
         </w:rPr>
         <w:t xml:space="preserve">3. Why </w:t>
       </w:r>
-      <w:proofErr w:type="spellStart"/>
       <w:r>
         <w:rPr>
           <w:rFonts w:ascii="Times New Roman" w:eastAsia="Times New Roman" w:hAnsi="Times New Roman" w:cs="Times New Roman"/>
@@ -2953,9 +2933,8 @@
           <w:lang w:eastAsia="en-GB" w:bidi="as-IN"/>
           <w14:ligatures w14:val="none"/>
         </w:rPr>
-        <w:t>SyncUp</w:t>
-      </w:r>
-      <w:proofErr w:type="spellEnd"/>
+        <w:t>Sync</w:t>
+      </w:r>
       <w:r>
         <w:rPr>
           <w:rFonts w:ascii="Times New Roman" w:eastAsia="Times New Roman" w:hAnsi="Times New Roman" w:cs="Times New Roman"/>
@@ -2967,7 +2946,33 @@
           <w:lang w:eastAsia="en-GB" w:bidi="as-IN"/>
           <w14:ligatures w14:val="none"/>
         </w:rPr>
-        <w:t xml:space="preserve"> Flourishes — Not Decays</w:t>
+        <w:t>Radar</w:t>
+      </w:r>
+      <w:r>
+        <w:rPr>
+          <w:rFonts w:ascii="Times New Roman" w:eastAsia="Times New Roman" w:hAnsi="Times New Roman" w:cs="Times New Roman"/>
+          <w:b/>
+          <w:bCs/>
+          <w:kern w:val="0"/>
+          <w:sz w:val="28"/>
+          <w:szCs w:val="28"/>
+          <w:lang w:eastAsia="en-GB" w:bidi="as-IN"/>
+          <w14:ligatures w14:val="none"/>
+        </w:rPr>
+        <w:t xml:space="preserve"> </w:t>
+      </w:r>
+      <w:r>
+        <w:rPr>
+          <w:rFonts w:ascii="Times New Roman" w:eastAsia="Times New Roman" w:hAnsi="Times New Roman" w:cs="Times New Roman"/>
+          <w:b/>
+          <w:bCs/>
+          <w:kern w:val="0"/>
+          <w:sz w:val="28"/>
+          <w:szCs w:val="28"/>
+          <w:lang w:eastAsia="en-GB" w:bidi="as-IN"/>
+          <w14:ligatures w14:val="none"/>
+        </w:rPr>
+        <w:t>Flourishes — Not Decays</w:t>
       </w:r>
     </w:p>
     <w:p>
@@ -2998,7 +3003,6 @@
         </w:rPr>
         <w:t xml:space="preserve">The Assembly Programming Trap — And Why </w:t>
       </w:r>
-      <w:proofErr w:type="spellStart"/>
       <w:r>
         <w:rPr>
           <w:rFonts w:ascii="Times New Roman" w:eastAsia="Times New Roman" w:hAnsi="Times New Roman" w:cs="Times New Roman"/>
@@ -3010,9 +3014,8 @@
           <w:lang w:eastAsia="en-GB" w:bidi="as-IN"/>
           <w14:ligatures w14:val="none"/>
         </w:rPr>
-        <w:t>SyncUp</w:t>
-      </w:r>
-      <w:proofErr w:type="spellEnd"/>
+        <w:t>Sync</w:t>
+      </w:r>
       <w:r>
         <w:rPr>
           <w:rFonts w:ascii="Times New Roman" w:eastAsia="Times New Roman" w:hAnsi="Times New Roman" w:cs="Times New Roman"/>
@@ -3024,7 +3027,33 @@
           <w:lang w:eastAsia="en-GB" w:bidi="as-IN"/>
           <w14:ligatures w14:val="none"/>
         </w:rPr>
-        <w:t xml:space="preserve"> Avoids It</w:t>
+        <w:t>Radar</w:t>
+      </w:r>
+      <w:r>
+        <w:rPr>
+          <w:rFonts w:ascii="Times New Roman" w:eastAsia="Times New Roman" w:hAnsi="Times New Roman" w:cs="Times New Roman"/>
+          <w:b/>
+          <w:bCs/>
+          <w:kern w:val="0"/>
+          <w:sz w:val="28"/>
+          <w:szCs w:val="28"/>
+          <w:lang w:eastAsia="en-GB" w:bidi="as-IN"/>
+          <w14:ligatures w14:val="none"/>
+        </w:rPr>
+        <w:t xml:space="preserve"> </w:t>
+      </w:r>
+      <w:r>
+        <w:rPr>
+          <w:rFonts w:ascii="Times New Roman" w:eastAsia="Times New Roman" w:hAnsi="Times New Roman" w:cs="Times New Roman"/>
+          <w:b/>
+          <w:bCs/>
+          <w:kern w:val="0"/>
+          <w:sz w:val="28"/>
+          <w:szCs w:val="28"/>
+          <w:lang w:eastAsia="en-GB" w:bidi="as-IN"/>
+          <w14:ligatures w14:val="none"/>
+        </w:rPr>
+        <w:t>Avoids It</w:t>
       </w:r>
     </w:p>
     <w:p>
@@ -3087,29 +3116,53 @@
           <w14:ligatures w14:val="none"/>
         </w:rPr>
       </w:pPr>
-      <w:proofErr w:type="spellStart"/>
-      <w:r>
-        <w:rPr>
-          <w:rFonts w:ascii="Times New Roman" w:eastAsia="Times New Roman" w:hAnsi="Times New Roman" w:cs="Times New Roman"/>
-          <w:kern w:val="0"/>
-          <w:sz w:val="28"/>
-          <w:szCs w:val="28"/>
-          <w:lang w:eastAsia="en-GB" w:bidi="as-IN"/>
-          <w14:ligatures w14:val="none"/>
-        </w:rPr>
-        <w:t>SyncUp</w:t>
-      </w:r>
-      <w:proofErr w:type="spellEnd"/>
-      <w:r>
-        <w:rPr>
-          <w:rFonts w:ascii="Times New Roman" w:eastAsia="Times New Roman" w:hAnsi="Times New Roman" w:cs="Times New Roman"/>
-          <w:kern w:val="0"/>
-          <w:sz w:val="28"/>
-          <w:szCs w:val="28"/>
-          <w:lang w:eastAsia="en-GB" w:bidi="as-IN"/>
-          <w14:ligatures w14:val="none"/>
-        </w:rPr>
-        <w:t xml:space="preserve"> does not teach production skills. It teaches </w:t>
+      <w:r>
+        <w:rPr>
+          <w:rFonts w:ascii="Times New Roman" w:eastAsia="Times New Roman" w:hAnsi="Times New Roman" w:cs="Times New Roman"/>
+          <w:b/>
+          <w:bCs/>
+          <w:kern w:val="0"/>
+          <w:sz w:val="28"/>
+          <w:szCs w:val="28"/>
+          <w:lang w:eastAsia="en-GB" w:bidi="as-IN"/>
+          <w14:ligatures w14:val="none"/>
+        </w:rPr>
+        <w:t>Sync</w:t>
+      </w:r>
+      <w:r>
+        <w:rPr>
+          <w:rFonts w:ascii="Times New Roman" w:eastAsia="Times New Roman" w:hAnsi="Times New Roman" w:cs="Times New Roman"/>
+          <w:b/>
+          <w:bCs/>
+          <w:kern w:val="0"/>
+          <w:sz w:val="28"/>
+          <w:szCs w:val="28"/>
+          <w:lang w:eastAsia="en-GB" w:bidi="as-IN"/>
+          <w14:ligatures w14:val="none"/>
+        </w:rPr>
+        <w:t>Radar</w:t>
+      </w:r>
+      <w:r>
+        <w:rPr>
+          <w:rFonts w:ascii="Times New Roman" w:eastAsia="Times New Roman" w:hAnsi="Times New Roman" w:cs="Times New Roman"/>
+          <w:kern w:val="0"/>
+          <w:sz w:val="28"/>
+          <w:szCs w:val="28"/>
+          <w:lang w:eastAsia="en-GB" w:bidi="as-IN"/>
+          <w14:ligatures w14:val="none"/>
+        </w:rPr>
+        <w:t xml:space="preserve"> </w:t>
+      </w:r>
+      <w:r>
+        <w:rPr>
+          <w:rFonts w:ascii="Times New Roman" w:eastAsia="Times New Roman" w:hAnsi="Times New Roman" w:cs="Times New Roman"/>
+          <w:kern w:val="0"/>
+          <w:sz w:val="28"/>
+          <w:szCs w:val="28"/>
+          <w:lang w:eastAsia="en-GB" w:bidi="as-IN"/>
+          <w14:ligatures w14:val="none"/>
+        </w:rPr>
+        <w:t xml:space="preserve">does not teach production skills. It teaches </w:t>
       </w:r>
       <w:r>
         <w:rPr>
@@ -3149,9 +3202,9 @@
         <w:tblLook w:val="04A0" w:firstRow="1" w:lastRow="0" w:firstColumn="1" w:lastColumn="0" w:noHBand="0" w:noVBand="1"/>
       </w:tblPr>
       <w:tblGrid>
-        <w:gridCol w:w="2428"/>
-        <w:gridCol w:w="3520"/>
-        <w:gridCol w:w="4518"/>
+        <w:gridCol w:w="2417"/>
+        <w:gridCol w:w="3504"/>
+        <w:gridCol w:w="4545"/>
       </w:tblGrid>
       <w:tr>
         <w:trPr>
@@ -3232,33 +3285,70 @@
                 <w14:ligatures w14:val="none"/>
               </w:rPr>
             </w:pPr>
-            <w:proofErr w:type="spellStart"/>
-            <w:r>
-              <w:rPr>
-                <w:rFonts w:ascii="Times New Roman" w:eastAsia="Times New Roman" w:hAnsi="Times New Roman" w:cs="Times New Roman"/>
-                <w:b/>
-                <w:bCs/>
-                <w:kern w:val="0"/>
-                <w:sz w:val="28"/>
-                <w:szCs w:val="28"/>
-                <w:lang w:eastAsia="en-GB" w:bidi="as-IN"/>
-                <w14:ligatures w14:val="none"/>
-              </w:rPr>
-              <w:t>SyncUp's</w:t>
-            </w:r>
-            <w:proofErr w:type="spellEnd"/>
-            <w:r>
-              <w:rPr>
-                <w:rFonts w:ascii="Times New Roman" w:eastAsia="Times New Roman" w:hAnsi="Times New Roman" w:cs="Times New Roman"/>
-                <w:b/>
-                <w:bCs/>
-                <w:kern w:val="0"/>
-                <w:sz w:val="28"/>
-                <w:szCs w:val="28"/>
-                <w:lang w:eastAsia="en-GB" w:bidi="as-IN"/>
-                <w14:ligatures w14:val="none"/>
-              </w:rPr>
-              <w:t xml:space="preserve"> Curriculum</w:t>
+            <w:r>
+              <w:rPr>
+                <w:rFonts w:ascii="Times New Roman" w:eastAsia="Times New Roman" w:hAnsi="Times New Roman" w:cs="Times New Roman"/>
+                <w:b/>
+                <w:bCs/>
+                <w:kern w:val="0"/>
+                <w:sz w:val="28"/>
+                <w:szCs w:val="28"/>
+                <w:lang w:eastAsia="en-GB" w:bidi="as-IN"/>
+                <w14:ligatures w14:val="none"/>
+              </w:rPr>
+              <w:t>Sync</w:t>
+            </w:r>
+            <w:r>
+              <w:rPr>
+                <w:rFonts w:ascii="Times New Roman" w:eastAsia="Times New Roman" w:hAnsi="Times New Roman" w:cs="Times New Roman"/>
+                <w:b/>
+                <w:bCs/>
+                <w:kern w:val="0"/>
+                <w:sz w:val="28"/>
+                <w:szCs w:val="28"/>
+                <w:lang w:eastAsia="en-GB" w:bidi="as-IN"/>
+                <w14:ligatures w14:val="none"/>
+              </w:rPr>
+              <w:t>Radar</w:t>
+            </w:r>
+            <w:r>
+              <w:rPr>
+                <w:rFonts w:ascii="Times New Roman" w:eastAsia="Times New Roman" w:hAnsi="Times New Roman" w:cs="Times New Roman"/>
+                <w:b/>
+                <w:bCs/>
+                <w:kern w:val="0"/>
+                <w:sz w:val="28"/>
+                <w:szCs w:val="28"/>
+                <w:lang w:eastAsia="en-GB" w:bidi="as-IN"/>
+                <w14:ligatures w14:val="none"/>
+              </w:rPr>
+              <w:t>’s</w:t>
+            </w:r>
+            <w:r>
+              <w:rPr>
+                <w:rFonts w:ascii="Times New Roman" w:eastAsia="Times New Roman" w:hAnsi="Times New Roman" w:cs="Times New Roman"/>
+                <w:b/>
+                <w:bCs/>
+                <w:kern w:val="0"/>
+                <w:sz w:val="28"/>
+                <w:szCs w:val="28"/>
+                <w:lang w:eastAsia="en-GB" w:bidi="as-IN"/>
+                <w14:ligatures w14:val="none"/>
+              </w:rPr>
+              <w:t xml:space="preserve"> </w:t>
+            </w:r>
+            <w:r>
+              <w:rPr>
+                <w:rFonts w:ascii="Times New Roman" w:eastAsia="Times New Roman" w:hAnsi="Times New Roman" w:cs="Times New Roman"/>
+                <w:b/>
+                <w:bCs/>
+                <w:kern w:val="0"/>
+                <w:sz w:val="28"/>
+                <w:szCs w:val="28"/>
+                <w:lang w:eastAsia="en-GB" w:bidi="as-IN"/>
+                <w14:ligatures w14:val="none"/>
+              </w:rPr>
+              <w:t>Curriculum</w:t>
             </w:r>
           </w:p>
         </w:tc>
@@ -3906,6 +3996,7 @@
           <w:lang w:eastAsia="en-GB" w:bidi="as-IN"/>
           <w14:ligatures w14:val="none"/>
         </w:rPr>
+        <w:lastRenderedPageBreak/>
         <w:t>Someone has to ask: is this the right approach? Is this output trustworthy? Are there risks?</w:t>
       </w:r>
     </w:p>
@@ -4047,7 +4138,6 @@
           <w:lang w:eastAsia="en-GB" w:bidi="as-IN"/>
           <w14:ligatures w14:val="none"/>
         </w:rPr>
-        <w:lastRenderedPageBreak/>
         <w:t>These are $100K-$10M decisions</w:t>
       </w:r>
     </w:p>
@@ -4243,35 +4333,7 @@
           <w:lang w:eastAsia="en-GB" w:bidi="as-IN"/>
           <w14:ligatures w14:val="none"/>
         </w:rPr>
-        <w:t xml:space="preserve">This is exactly </w:t>
-      </w:r>
-      <w:proofErr w:type="spellStart"/>
-      <w:r>
-        <w:rPr>
-          <w:rFonts w:ascii="Times New Roman" w:eastAsia="Times New Roman" w:hAnsi="Times New Roman" w:cs="Times New Roman"/>
-          <w:b/>
-          <w:bCs/>
-          <w:kern w:val="0"/>
-          <w:sz w:val="28"/>
-          <w:szCs w:val="28"/>
-          <w:lang w:eastAsia="en-GB" w:bidi="as-IN"/>
-          <w14:ligatures w14:val="none"/>
-        </w:rPr>
-        <w:t>SyncUp's</w:t>
-      </w:r>
-      <w:proofErr w:type="spellEnd"/>
-      <w:r>
-        <w:rPr>
-          <w:rFonts w:ascii="Times New Roman" w:eastAsia="Times New Roman" w:hAnsi="Times New Roman" w:cs="Times New Roman"/>
-          <w:b/>
-          <w:bCs/>
-          <w:kern w:val="0"/>
-          <w:sz w:val="28"/>
-          <w:szCs w:val="28"/>
-          <w:lang w:eastAsia="en-GB" w:bidi="as-IN"/>
-          <w14:ligatures w14:val="none"/>
-        </w:rPr>
-        <w:t xml:space="preserve"> Radar value proposition</w:t>
+        <w:t>This is exactly SyncUp's Radar value proposition</w:t>
       </w:r>
     </w:p>
     <w:p>
@@ -4311,15 +4373,15 @@
       </w:pPr>
       <w:r>
         <w:rPr>
-          <w:rFonts w:ascii="Times New Roman" w:eastAsia="Times New Roman" w:hAnsi="Times New Roman" w:cs="Times New Roman"/>
           <w:noProof/>
-          <w:kern w:val="0"/>
-          <w:sz w:val="28"/>
-          <w:szCs w:val="28"/>
-          <w:lang w:eastAsia="en-GB" w:bidi="as-IN"/>
-        </w:rPr>
-        <w:pict w14:anchorId="6FE549CD">
-          <v:rect id="_x0000_i1031" alt="" style="width:451.3pt;height:.05pt;mso-width-percent:0;mso-height-percent:0;mso-width-percent:0;mso-height-percent:0" o:hralign="center" o:hrstd="t" o:hr="t" fillcolor="#a0a0a0" stroked="f"/>
+        </w:rPr>
+      </w:r>
+      <w:r>
+        <w:pict w14:anchorId="2568CA96">
+          <v:rect id="Horizontal Line 4" o:spid="_x0000_s1032" style="width:523.3pt;height:.05pt;visibility:visible;mso-wrap-style:square;mso-left-percent:-10001;mso-top-percent:-10001;mso-position-horizontal:absolute;mso-position-horizontal-relative:char;mso-position-vertical:absolute;mso-position-vertical-relative:line;mso-left-percent:-10001;mso-top-percent:-10001;v-text-anchor:top" o:gfxdata="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" filled="f">
+            <o:lock v:ext="edit" rotation="t" aspectratio="t" verticies="t" text="t" shapetype="t"/>
+            <w10:anchorlock/>
+          </v:rect>
         </w:pict>
       </w:r>
     </w:p>
@@ -5006,7 +5068,6 @@
         <w:t xml:space="preserve">India has 1.5 million AI professionals today, projected to reach 2.3 million by 2027. </w:t>
       </w:r>
       <w:hyperlink r:id="rId9" w:tgtFrame="_blank" w:history="1">
-        <w:proofErr w:type="spellStart"/>
         <w:r>
           <w:rPr>
             <w:rFonts w:ascii="Times New Roman" w:eastAsia="Times New Roman" w:hAnsi="Times New Roman" w:cs="Times New Roman"/>
@@ -5020,7 +5081,6 @@
           </w:rPr>
           <w:t>AIRadar</w:t>
         </w:r>
-        <w:proofErr w:type="spellEnd"/>
       </w:hyperlink>
     </w:p>
     <w:p>
@@ -5499,10 +5559,10 @@
           <w:lang w:eastAsia="en-GB" w:bidi="as-IN"/>
           <w14:ligatures w14:val="none"/>
         </w:rPr>
+        <w:lastRenderedPageBreak/>
         <w:t xml:space="preserve">The World Economic Forum projects 170 million new AI-driven jobs created by 2030, and workers with AI skills earn a 56% wage premium over equivalent peers. </w:t>
       </w:r>
       <w:hyperlink r:id="rId10" w:tgtFrame="_blank" w:history="1">
-        <w:proofErr w:type="spellStart"/>
         <w:r>
           <w:rPr>
             <w:rFonts w:ascii="Times New Roman" w:eastAsia="Times New Roman" w:hAnsi="Times New Roman" w:cs="Times New Roman"/>
@@ -5516,7 +5576,6 @@
           </w:rPr>
           <w:t>AIRadar</w:t>
         </w:r>
-        <w:proofErr w:type="spellEnd"/>
       </w:hyperlink>
     </w:p>
     <w:p>
@@ -5532,15 +5591,15 @@
       </w:pPr>
       <w:r>
         <w:rPr>
-          <w:rFonts w:ascii="Times New Roman" w:eastAsia="Times New Roman" w:hAnsi="Times New Roman" w:cs="Times New Roman"/>
           <w:noProof/>
-          <w:kern w:val="0"/>
-          <w:sz w:val="28"/>
-          <w:szCs w:val="28"/>
-          <w:lang w:eastAsia="en-GB" w:bidi="as-IN"/>
-        </w:rPr>
-        <w:pict w14:anchorId="4A4D2DA4">
-          <v:rect id="_x0000_i1030" alt="" style="width:451.3pt;height:.05pt;mso-width-percent:0;mso-height-percent:0;mso-width-percent:0;mso-height-percent:0" o:hralign="center" o:hrstd="t" o:hr="t" fillcolor="#a0a0a0" stroked="f"/>
+        </w:rPr>
+      </w:r>
+      <w:r>
+        <w:pict w14:anchorId="3DF4D9B5">
+          <v:rect id="Horizontal Line 5" o:spid="_x0000_s1031" style="width:523.3pt;height:.05pt;visibility:visible;mso-wrap-style:square;mso-left-percent:-10001;mso-top-percent:-10001;mso-position-horizontal:absolute;mso-position-horizontal-relative:char;mso-position-vertical:absolute;mso-position-vertical-relative:line;mso-left-percent:-10001;mso-top-percent:-10001;v-text-anchor:top" o:gfxdata="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" filled="f">
+            <o:lock v:ext="edit" rotation="t" aspectratio="t" verticies="t" text="t" shapetype="t"/>
+            <w10:anchorlock/>
+          </v:rect>
         </w:pict>
       </w:r>
     </w:p>
@@ -5656,7 +5715,6 @@
                 <w:lang w:eastAsia="en-GB" w:bidi="as-IN"/>
                 <w14:ligatures w14:val="none"/>
               </w:rPr>
-              <w:lastRenderedPageBreak/>
               <w:t>Plan</w:t>
             </w:r>
           </w:p>
@@ -6416,15 +6474,15 @@
       </w:pPr>
       <w:r>
         <w:rPr>
-          <w:rFonts w:ascii="Times New Roman" w:eastAsia="Times New Roman" w:hAnsi="Times New Roman" w:cs="Times New Roman"/>
           <w:noProof/>
-          <w:kern w:val="0"/>
-          <w:sz w:val="28"/>
-          <w:szCs w:val="28"/>
-          <w:lang w:eastAsia="en-GB" w:bidi="as-IN"/>
-        </w:rPr>
-        <w:pict w14:anchorId="0DDCC346">
-          <v:rect id="_x0000_i1029" alt="" style="width:451.3pt;height:.05pt;mso-width-percent:0;mso-height-percent:0;mso-width-percent:0;mso-height-percent:0" o:hralign="center" o:hrstd="t" o:hr="t" fillcolor="#a0a0a0" stroked="f"/>
+        </w:rPr>
+      </w:r>
+      <w:r>
+        <w:pict w14:anchorId="3A7138EA">
+          <v:rect id="Horizontal Line 6" o:spid="_x0000_s1030" style="width:523.3pt;height:.05pt;visibility:visible;mso-wrap-style:square;mso-left-percent:-10001;mso-top-percent:-10001;mso-position-horizontal:absolute;mso-position-horizontal-relative:char;mso-position-vertical:absolute;mso-position-vertical-relative:line;mso-left-percent:-10001;mso-top-percent:-10001;v-text-anchor:top" o:gfxdata="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" filled="f">
+            <o:lock v:ext="edit" rotation="t" aspectratio="t" verticies="t" text="t" shapetype="t"/>
+            <w10:anchorlock/>
+          </v:rect>
         </w:pict>
       </w:r>
     </w:p>
@@ -6711,21 +6769,8 @@
                 <w:lang w:eastAsia="en-GB" w:bidi="as-IN"/>
                 <w14:ligatures w14:val="none"/>
               </w:rPr>
-              <w:t>₹399/</w:t>
-            </w:r>
-            <w:proofErr w:type="spellStart"/>
-            <w:r>
-              <w:rPr>
-                <w:rFonts w:ascii="Times New Roman" w:eastAsia="Times New Roman" w:hAnsi="Times New Roman" w:cs="Times New Roman"/>
-                <w:kern w:val="0"/>
-                <w:sz w:val="28"/>
-                <w:szCs w:val="28"/>
-                <w:lang w:eastAsia="en-GB" w:bidi="as-IN"/>
-                <w14:ligatures w14:val="none"/>
-              </w:rPr>
-              <w:t>mo</w:t>
-            </w:r>
-            <w:proofErr w:type="spellEnd"/>
+              <w:t>₹399/mo</w:t>
+            </w:r>
           </w:p>
         </w:tc>
         <w:tc>
@@ -6849,21 +6894,8 @@
                 <w:lang w:eastAsia="en-GB" w:bidi="as-IN"/>
                 <w14:ligatures w14:val="none"/>
               </w:rPr>
-              <w:t>₹1,199/seat/</w:t>
-            </w:r>
-            <w:proofErr w:type="spellStart"/>
-            <w:r>
-              <w:rPr>
-                <w:rFonts w:ascii="Times New Roman" w:eastAsia="Times New Roman" w:hAnsi="Times New Roman" w:cs="Times New Roman"/>
-                <w:kern w:val="0"/>
-                <w:sz w:val="28"/>
-                <w:szCs w:val="28"/>
-                <w:lang w:eastAsia="en-GB" w:bidi="as-IN"/>
-                <w14:ligatures w14:val="none"/>
-              </w:rPr>
-              <w:t>mo</w:t>
-            </w:r>
-            <w:proofErr w:type="spellEnd"/>
+              <w:t>₹1,199/seat/mo</w:t>
+            </w:r>
           </w:p>
         </w:tc>
         <w:tc>
@@ -6987,21 +7019,8 @@
                 <w:lang w:eastAsia="en-GB" w:bidi="as-IN"/>
                 <w14:ligatures w14:val="none"/>
               </w:rPr>
-              <w:t>$12/</w:t>
-            </w:r>
-            <w:proofErr w:type="spellStart"/>
-            <w:r>
-              <w:rPr>
-                <w:rFonts w:ascii="Times New Roman" w:eastAsia="Times New Roman" w:hAnsi="Times New Roman" w:cs="Times New Roman"/>
-                <w:kern w:val="0"/>
-                <w:sz w:val="28"/>
-                <w:szCs w:val="28"/>
-                <w:lang w:eastAsia="en-GB" w:bidi="as-IN"/>
-                <w14:ligatures w14:val="none"/>
-              </w:rPr>
-              <w:t>mo</w:t>
-            </w:r>
-            <w:proofErr w:type="spellEnd"/>
+              <w:t>$12/mo</w:t>
+            </w:r>
           </w:p>
         </w:tc>
         <w:tc>
@@ -7193,15 +7212,15 @@
       </w:pPr>
       <w:r>
         <w:rPr>
-          <w:rFonts w:ascii="Times New Roman" w:eastAsia="Times New Roman" w:hAnsi="Times New Roman" w:cs="Times New Roman"/>
           <w:noProof/>
-          <w:kern w:val="0"/>
-          <w:sz w:val="28"/>
-          <w:szCs w:val="28"/>
-          <w:lang w:eastAsia="en-GB" w:bidi="as-IN"/>
-        </w:rPr>
-        <w:pict w14:anchorId="693C0DF9">
-          <v:rect id="_x0000_i1028" alt="" style="width:451.3pt;height:.05pt;mso-width-percent:0;mso-height-percent:0;mso-width-percent:0;mso-height-percent:0" o:hralign="center" o:hrstd="t" o:hr="t" fillcolor="#a0a0a0" stroked="f"/>
+        </w:rPr>
+      </w:r>
+      <w:r>
+        <w:pict w14:anchorId="6D141C6F">
+          <v:rect id="Horizontal Line 7" o:spid="_x0000_s1029" style="width:523.3pt;height:.05pt;visibility:visible;mso-wrap-style:square;mso-left-percent:-10001;mso-top-percent:-10001;mso-position-horizontal:absolute;mso-position-horizontal-relative:char;mso-position-vertical:absolute;mso-position-vertical-relative:line;mso-left-percent:-10001;mso-top-percent:-10001;v-text-anchor:top" o:gfxdata="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" filled="f">
+            <o:lock v:ext="edit" rotation="t" aspectratio="t" verticies="t" text="t" shapetype="t"/>
+            <w10:anchorlock/>
+          </v:rect>
         </w:pict>
       </w:r>
     </w:p>
@@ -7488,21 +7507,8 @@
                 <w:lang w:eastAsia="en-GB" w:bidi="as-IN"/>
                 <w14:ligatures w14:val="none"/>
               </w:rPr>
-              <w:t>₹399/</w:t>
-            </w:r>
-            <w:proofErr w:type="spellStart"/>
-            <w:r>
-              <w:rPr>
-                <w:rFonts w:ascii="Times New Roman" w:eastAsia="Times New Roman" w:hAnsi="Times New Roman" w:cs="Times New Roman"/>
-                <w:kern w:val="0"/>
-                <w:sz w:val="28"/>
-                <w:szCs w:val="28"/>
-                <w:lang w:eastAsia="en-GB" w:bidi="as-IN"/>
-                <w14:ligatures w14:val="none"/>
-              </w:rPr>
-              <w:t>mo</w:t>
-            </w:r>
-            <w:proofErr w:type="spellEnd"/>
+              <w:t>₹399/mo</w:t>
+            </w:r>
           </w:p>
         </w:tc>
         <w:tc>
@@ -7626,21 +7632,8 @@
                 <w:lang w:eastAsia="en-GB" w:bidi="as-IN"/>
                 <w14:ligatures w14:val="none"/>
               </w:rPr>
-              <w:t>₹1,199/seat/</w:t>
-            </w:r>
-            <w:proofErr w:type="spellStart"/>
-            <w:r>
-              <w:rPr>
-                <w:rFonts w:ascii="Times New Roman" w:eastAsia="Times New Roman" w:hAnsi="Times New Roman" w:cs="Times New Roman"/>
-                <w:kern w:val="0"/>
-                <w:sz w:val="28"/>
-                <w:szCs w:val="28"/>
-                <w:lang w:eastAsia="en-GB" w:bidi="as-IN"/>
-                <w14:ligatures w14:val="none"/>
-              </w:rPr>
-              <w:t>mo</w:t>
-            </w:r>
-            <w:proofErr w:type="spellEnd"/>
+              <w:t>₹1,199/seat/mo</w:t>
+            </w:r>
           </w:p>
         </w:tc>
         <w:tc>
@@ -7764,21 +7757,8 @@
                 <w:lang w:eastAsia="en-GB" w:bidi="as-IN"/>
                 <w14:ligatures w14:val="none"/>
               </w:rPr>
-              <w:t xml:space="preserve">₹10L </w:t>
-            </w:r>
-            <w:proofErr w:type="spellStart"/>
-            <w:r>
-              <w:rPr>
-                <w:rFonts w:ascii="Times New Roman" w:eastAsia="Times New Roman" w:hAnsi="Times New Roman" w:cs="Times New Roman"/>
-                <w:kern w:val="0"/>
-                <w:sz w:val="28"/>
-                <w:szCs w:val="28"/>
-                <w:lang w:eastAsia="en-GB" w:bidi="as-IN"/>
-                <w14:ligatures w14:val="none"/>
-              </w:rPr>
-              <w:t>avg</w:t>
-            </w:r>
-            <w:proofErr w:type="spellEnd"/>
+              <w:t>₹10L avg</w:t>
+            </w:r>
           </w:p>
         </w:tc>
         <w:tc>
@@ -7902,21 +7882,8 @@
                 <w:lang w:eastAsia="en-GB" w:bidi="as-IN"/>
                 <w14:ligatures w14:val="none"/>
               </w:rPr>
-              <w:t>$15/</w:t>
-            </w:r>
-            <w:proofErr w:type="spellStart"/>
-            <w:r>
-              <w:rPr>
-                <w:rFonts w:ascii="Times New Roman" w:eastAsia="Times New Roman" w:hAnsi="Times New Roman" w:cs="Times New Roman"/>
-                <w:kern w:val="0"/>
-                <w:sz w:val="28"/>
-                <w:szCs w:val="28"/>
-                <w:lang w:eastAsia="en-GB" w:bidi="as-IN"/>
-                <w14:ligatures w14:val="none"/>
-              </w:rPr>
-              <w:t>mo</w:t>
-            </w:r>
-            <w:proofErr w:type="spellEnd"/>
+              <w:t>$15/mo</w:t>
+            </w:r>
           </w:p>
         </w:tc>
         <w:tc>
@@ -8108,15 +8075,15 @@
       </w:pPr>
       <w:r>
         <w:rPr>
-          <w:rFonts w:ascii="Times New Roman" w:eastAsia="Times New Roman" w:hAnsi="Times New Roman" w:cs="Times New Roman"/>
           <w:noProof/>
-          <w:kern w:val="0"/>
-          <w:sz w:val="28"/>
-          <w:szCs w:val="28"/>
-          <w:lang w:eastAsia="en-GB" w:bidi="as-IN"/>
-        </w:rPr>
-        <w:pict w14:anchorId="3FF0F67A">
-          <v:rect id="_x0000_i1027" alt="" style="width:451.3pt;height:.05pt;mso-width-percent:0;mso-height-percent:0;mso-width-percent:0;mso-height-percent:0" o:hralign="center" o:hrstd="t" o:hr="t" fillcolor="#a0a0a0" stroked="f"/>
+        </w:rPr>
+      </w:r>
+      <w:r>
+        <w:pict w14:anchorId="360EC6FE">
+          <v:rect id="Horizontal Line 8" o:spid="_x0000_s1028" style="width:523.3pt;height:.05pt;visibility:visible;mso-wrap-style:square;mso-left-percent:-10001;mso-top-percent:-10001;mso-position-horizontal:absolute;mso-position-horizontal-relative:char;mso-position-vertical:absolute;mso-position-vertical-relative:line;mso-left-percent:-10001;mso-top-percent:-10001;v-text-anchor:top" o:gfxdata="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" filled="f">
+            <o:lock v:ext="edit" rotation="t" aspectratio="t" verticies="t" text="t" shapetype="t"/>
+            <w10:anchorlock/>
+          </v:rect>
         </w:pict>
       </w:r>
     </w:p>
@@ -8403,21 +8370,8 @@
                 <w:lang w:eastAsia="en-GB" w:bidi="as-IN"/>
                 <w14:ligatures w14:val="none"/>
               </w:rPr>
-              <w:t>₹499/</w:t>
-            </w:r>
-            <w:proofErr w:type="spellStart"/>
-            <w:r>
-              <w:rPr>
-                <w:rFonts w:ascii="Times New Roman" w:eastAsia="Times New Roman" w:hAnsi="Times New Roman" w:cs="Times New Roman"/>
-                <w:kern w:val="0"/>
-                <w:sz w:val="28"/>
-                <w:szCs w:val="28"/>
-                <w:lang w:eastAsia="en-GB" w:bidi="as-IN"/>
-                <w14:ligatures w14:val="none"/>
-              </w:rPr>
-              <w:t>mo</w:t>
-            </w:r>
-            <w:proofErr w:type="spellEnd"/>
+              <w:t>₹499/mo</w:t>
+            </w:r>
           </w:p>
         </w:tc>
         <w:tc>
@@ -8541,21 +8495,8 @@
                 <w:lang w:eastAsia="en-GB" w:bidi="as-IN"/>
                 <w14:ligatures w14:val="none"/>
               </w:rPr>
-              <w:t>₹1,499/seat/</w:t>
-            </w:r>
-            <w:proofErr w:type="spellStart"/>
-            <w:r>
-              <w:rPr>
-                <w:rFonts w:ascii="Times New Roman" w:eastAsia="Times New Roman" w:hAnsi="Times New Roman" w:cs="Times New Roman"/>
-                <w:kern w:val="0"/>
-                <w:sz w:val="28"/>
-                <w:szCs w:val="28"/>
-                <w:lang w:eastAsia="en-GB" w:bidi="as-IN"/>
-                <w14:ligatures w14:val="none"/>
-              </w:rPr>
-              <w:t>mo</w:t>
-            </w:r>
-            <w:proofErr w:type="spellEnd"/>
+              <w:t>₹1,499/seat/mo</w:t>
+            </w:r>
           </w:p>
         </w:tc>
         <w:tc>
@@ -8679,21 +8620,8 @@
                 <w:lang w:eastAsia="en-GB" w:bidi="as-IN"/>
                 <w14:ligatures w14:val="none"/>
               </w:rPr>
-              <w:t xml:space="preserve">₹12L </w:t>
-            </w:r>
-            <w:proofErr w:type="spellStart"/>
-            <w:r>
-              <w:rPr>
-                <w:rFonts w:ascii="Times New Roman" w:eastAsia="Times New Roman" w:hAnsi="Times New Roman" w:cs="Times New Roman"/>
-                <w:kern w:val="0"/>
-                <w:sz w:val="28"/>
-                <w:szCs w:val="28"/>
-                <w:lang w:eastAsia="en-GB" w:bidi="as-IN"/>
-                <w14:ligatures w14:val="none"/>
-              </w:rPr>
-              <w:t>avg</w:t>
-            </w:r>
-            <w:proofErr w:type="spellEnd"/>
+              <w:t>₹12L avg</w:t>
+            </w:r>
           </w:p>
         </w:tc>
         <w:tc>
@@ -8757,7 +8685,6 @@
                 <w:lang w:eastAsia="en-GB" w:bidi="as-IN"/>
                 <w14:ligatures w14:val="none"/>
               </w:rPr>
-              <w:lastRenderedPageBreak/>
               <w:t>Global B2C</w:t>
             </w:r>
           </w:p>
@@ -8818,21 +8745,8 @@
                 <w:lang w:eastAsia="en-GB" w:bidi="as-IN"/>
                 <w14:ligatures w14:val="none"/>
               </w:rPr>
-              <w:t>$18/</w:t>
-            </w:r>
-            <w:proofErr w:type="spellStart"/>
-            <w:r>
-              <w:rPr>
-                <w:rFonts w:ascii="Times New Roman" w:eastAsia="Times New Roman" w:hAnsi="Times New Roman" w:cs="Times New Roman"/>
-                <w:kern w:val="0"/>
-                <w:sz w:val="28"/>
-                <w:szCs w:val="28"/>
-                <w:lang w:eastAsia="en-GB" w:bidi="as-IN"/>
-                <w14:ligatures w14:val="none"/>
-              </w:rPr>
-              <w:t>mo</w:t>
-            </w:r>
-            <w:proofErr w:type="spellEnd"/>
+              <w:t>$18/mo</w:t>
+            </w:r>
           </w:p>
         </w:tc>
         <w:tc>
@@ -8956,21 +8870,8 @@
                 <w:lang w:eastAsia="en-GB" w:bidi="as-IN"/>
                 <w14:ligatures w14:val="none"/>
               </w:rPr>
-              <w:t xml:space="preserve">₹5L </w:t>
-            </w:r>
-            <w:proofErr w:type="spellStart"/>
-            <w:r>
-              <w:rPr>
-                <w:rFonts w:ascii="Times New Roman" w:eastAsia="Times New Roman" w:hAnsi="Times New Roman" w:cs="Times New Roman"/>
-                <w:kern w:val="0"/>
-                <w:sz w:val="28"/>
-                <w:szCs w:val="28"/>
-                <w:lang w:eastAsia="en-GB" w:bidi="as-IN"/>
-                <w14:ligatures w14:val="none"/>
-              </w:rPr>
-              <w:t>avg</w:t>
-            </w:r>
-            <w:proofErr w:type="spellEnd"/>
+              <w:t>₹5L avg</w:t>
+            </w:r>
           </w:p>
         </w:tc>
         <w:tc>
@@ -9162,15 +9063,15 @@
       </w:pPr>
       <w:r>
         <w:rPr>
-          <w:rFonts w:ascii="Times New Roman" w:eastAsia="Times New Roman" w:hAnsi="Times New Roman" w:cs="Times New Roman"/>
           <w:noProof/>
-          <w:kern w:val="0"/>
-          <w:sz w:val="28"/>
-          <w:szCs w:val="28"/>
-          <w:lang w:eastAsia="en-GB" w:bidi="as-IN"/>
-        </w:rPr>
-        <w:pict w14:anchorId="1A2C8B2D">
-          <v:rect id="_x0000_i1026" alt="" style="width:451.3pt;height:.05pt;mso-width-percent:0;mso-height-percent:0;mso-width-percent:0;mso-height-percent:0" o:hralign="center" o:hrstd="t" o:hr="t" fillcolor="#a0a0a0" stroked="f"/>
+        </w:rPr>
+      </w:r>
+      <w:r>
+        <w:pict w14:anchorId="1A6615BF">
+          <v:rect id="Horizontal Line 9" o:spid="_x0000_s1027" style="width:523.3pt;height:.05pt;visibility:visible;mso-wrap-style:square;mso-left-percent:-10001;mso-top-percent:-10001;mso-position-horizontal:absolute;mso-position-horizontal-relative:char;mso-position-vertical:absolute;mso-position-vertical-relative:line;mso-left-percent:-10001;mso-top-percent:-10001;v-text-anchor:top" o:gfxdata="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" filled="f">
+            <o:lock v:ext="edit" rotation="t" aspectratio="t" verticies="t" text="t" shapetype="t"/>
+            <w10:anchorlock/>
+          </v:rect>
         </w:pict>
       </w:r>
     </w:p>
@@ -9888,15 +9789,15 @@
       </w:pPr>
       <w:r>
         <w:rPr>
-          <w:rFonts w:ascii="Times New Roman" w:eastAsia="Times New Roman" w:hAnsi="Times New Roman" w:cs="Times New Roman"/>
           <w:noProof/>
-          <w:kern w:val="0"/>
-          <w:sz w:val="28"/>
-          <w:szCs w:val="28"/>
-          <w:lang w:eastAsia="en-GB" w:bidi="as-IN"/>
-        </w:rPr>
-        <w:pict w14:anchorId="39E4038E">
-          <v:rect id="_x0000_i1025" alt="" style="width:451.3pt;height:.05pt;mso-width-percent:0;mso-height-percent:0;mso-width-percent:0;mso-height-percent:0" o:hralign="center" o:hrstd="t" o:hr="t" fillcolor="#a0a0a0" stroked="f"/>
+        </w:rPr>
+      </w:r>
+      <w:r>
+        <w:pict w14:anchorId="09CFF71D">
+          <v:rect id="Horizontal Line 10" o:spid="_x0000_s1026" style="width:523.3pt;height:.05pt;visibility:visible;mso-wrap-style:square;mso-left-percent:-10001;mso-top-percent:-10001;mso-position-horizontal:absolute;mso-position-horizontal-relative:char;mso-position-vertical:absolute;mso-position-vertical-relative:line;mso-left-percent:-10001;mso-top-percent:-10001;v-text-anchor:top" o:gfxdata="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" filled="f">
+            <o:lock v:ext="edit" rotation="t" aspectratio="t" verticies="t" text="t" shapetype="t"/>
+            <w10:anchorlock/>
+          </v:rect>
         </w:pict>
       </w:r>
     </w:p>
@@ -9950,31 +9851,7 @@
           <w:lang w:eastAsia="en-GB" w:bidi="as-IN"/>
           <w14:ligatures w14:val="none"/>
         </w:rPr>
-        <w:t xml:space="preserve">The Sync Score is not a feature. It is </w:t>
-      </w:r>
-      <w:proofErr w:type="spellStart"/>
-      <w:r>
-        <w:rPr>
-          <w:rFonts w:ascii="Times New Roman" w:eastAsia="Times New Roman" w:hAnsi="Times New Roman" w:cs="Times New Roman"/>
-          <w:kern w:val="0"/>
-          <w:sz w:val="28"/>
-          <w:szCs w:val="28"/>
-          <w:lang w:eastAsia="en-GB" w:bidi="as-IN"/>
-          <w14:ligatures w14:val="none"/>
-        </w:rPr>
-        <w:t>SyncUp's</w:t>
-      </w:r>
-      <w:proofErr w:type="spellEnd"/>
-      <w:r>
-        <w:rPr>
-          <w:rFonts w:ascii="Times New Roman" w:eastAsia="Times New Roman" w:hAnsi="Times New Roman" w:cs="Times New Roman"/>
-          <w:kern w:val="0"/>
-          <w:sz w:val="28"/>
-          <w:szCs w:val="28"/>
-          <w:lang w:eastAsia="en-GB" w:bidi="as-IN"/>
-          <w14:ligatures w14:val="none"/>
-        </w:rPr>
-        <w:t xml:space="preserve"> distribution engine.</w:t>
+        <w:t>The Sync Score is not a feature. It is SyncUp's distribution engine.</w:t>
       </w:r>
     </w:p>
     <w:p>
@@ -9998,55 +9875,7 @@
           <w:lang w:eastAsia="en-GB" w:bidi="as-IN"/>
           <w14:ligatures w14:val="none"/>
         </w:rPr>
-        <w:t xml:space="preserve">Every professional who shares their Sync Score on LinkedIn is an unpaid </w:t>
-      </w:r>
-      <w:proofErr w:type="spellStart"/>
-      <w:r>
-        <w:rPr>
-          <w:rFonts w:ascii="Times New Roman" w:eastAsia="Times New Roman" w:hAnsi="Times New Roman" w:cs="Times New Roman"/>
-          <w:kern w:val="0"/>
-          <w:sz w:val="28"/>
-          <w:szCs w:val="28"/>
-          <w:lang w:eastAsia="en-GB" w:bidi="as-IN"/>
-          <w14:ligatures w14:val="none"/>
-        </w:rPr>
-        <w:t>SyncUp</w:t>
-      </w:r>
-      <w:proofErr w:type="spellEnd"/>
-      <w:r>
-        <w:rPr>
-          <w:rFonts w:ascii="Times New Roman" w:eastAsia="Times New Roman" w:hAnsi="Times New Roman" w:cs="Times New Roman"/>
-          <w:kern w:val="0"/>
-          <w:sz w:val="28"/>
-          <w:szCs w:val="28"/>
-          <w:lang w:eastAsia="en-GB" w:bidi="as-IN"/>
-          <w14:ligatures w14:val="none"/>
-        </w:rPr>
-        <w:t xml:space="preserve"> billboard — in the exact professional network where </w:t>
-      </w:r>
-      <w:proofErr w:type="spellStart"/>
-      <w:r>
-        <w:rPr>
-          <w:rFonts w:ascii="Times New Roman" w:eastAsia="Times New Roman" w:hAnsi="Times New Roman" w:cs="Times New Roman"/>
-          <w:kern w:val="0"/>
-          <w:sz w:val="28"/>
-          <w:szCs w:val="28"/>
-          <w:lang w:eastAsia="en-GB" w:bidi="as-IN"/>
-          <w14:ligatures w14:val="none"/>
-        </w:rPr>
-        <w:t>SyncUp's</w:t>
-      </w:r>
-      <w:proofErr w:type="spellEnd"/>
-      <w:r>
-        <w:rPr>
-          <w:rFonts w:ascii="Times New Roman" w:eastAsia="Times New Roman" w:hAnsi="Times New Roman" w:cs="Times New Roman"/>
-          <w:kern w:val="0"/>
-          <w:sz w:val="28"/>
-          <w:szCs w:val="28"/>
-          <w:lang w:eastAsia="en-GB" w:bidi="as-IN"/>
-          <w14:ligatures w14:val="none"/>
-        </w:rPr>
-        <w:t xml:space="preserve"> entire audience lives.</w:t>
+        <w:t>Every professional who shares their Sync Score on LinkedIn is an unpaid SyncUp billboard — in the exact professional network where SyncUp's entire audience lives.</w:t>
       </w:r>
     </w:p>
     <w:p>
@@ -10086,7 +9915,7 @@
 </file>
 
 <file path=word/numbering.xml><?xml version="1.0" encoding="utf-8"?>
-<w:numbering xmlns:wpc="http://schemas.microsoft.com/office/word/2010/wordprocessingCanvas" xmlns:cx="http://schemas.microsoft.com/office/drawing/2014/chartex" xmlns:cx1="http://schemas.microsoft.com/office/drawing/2015/9/8/chartex" xmlns:cx2="http://schemas.microsoft.com/office/drawing/2015/10/21/chartex" xmlns:cx3="http://schemas.microsoft.com/office/drawing/2016/5/9/chartex" xmlns:cx4="http://schemas.microsoft.com/office/drawing/2016/5/10/chartex" xmlns:cx5="http://schemas.microsoft.com/office/drawing/2016/5/11/chartex" xmlns:cx6="http://schemas.microsoft.com/office/drawing/2016/5/12/chartex" xmlns:cx7="http://schemas.microsoft.com/office/drawing/2016/5/13/chartex" xmlns:cx8="http://schemas.microsoft.com/office/drawing/2016/5/14/chartex" xmlns:mc="http://schemas.openxmlformats.org/markup-compatibility/2006" xmlns:aink="http://schemas.microsoft.com/office/drawing/2016/ink" xmlns:am3d="http://schemas.microsoft.com/office/drawing/2017/model3d" xmlns:o="urn:schemas-microsoft-com:office:office" xmlns:oel="http://schemas.microsoft.com/office/2019/extlst" xmlns:r="http://schemas.openxmlformats.org/officeDocument/2006/relationships" xmlns:m="http://schemas.openxmlformats.org/officeDocument/2006/math" xmlns:v="urn:schemas-microsoft-com:vml" xmlns:wp14="http://schemas.microsoft.com/office/word/2010/wordprocessingDrawing" xmlns:wp="http://schemas.openxmlformats.org/drawingml/2006/wordprocessingDrawing" xmlns:w10="urn:schemas-microsoft-com:office:word" xmlns:w="http://schemas.openxmlformats.org/wordprocessingml/2006/main" xmlns:w14="http://schemas.microsoft.com/office/word/2010/wordml" xmlns:w15="http://schemas.microsoft.com/office/word/2012/wordml" xmlns:w16cex="http://schemas.microsoft.com/office/word/2018/wordml/cex" xmlns:w16cid="http://schemas.microsoft.com/office/word/2016/wordml/cid" xmlns:w16="http://schemas.microsoft.com/office/word/2018/wordml" xmlns:w16du="http://schemas.microsoft.com/office/word/2023/wordml/word16du" xmlns:w16sdtdh="http://schemas.microsoft.com/office/word/2020/wordml/sdtdatahash" xmlns:w16sdtfl="http://schemas.microsoft.com/office/word/2024/wordml/sdtformatlock" xmlns:w16se="http://schemas.microsoft.com/office/word/2015/wordml/symex" xmlns:wpg="http://schemas.microsoft.com/office/word/2010/wordprocessingGroup" xmlns:wpi="http://schemas.microsoft.com/office/word/2010/wordprocessingInk" xmlns:wne="http://schemas.microsoft.com/office/word/2006/wordml" xmlns:wps="http://schemas.microsoft.com/office/word/2010/wordprocessingShape" mc:Ignorable="w14 w15 w16se w16cid w16 w16cex w16sdtdh w16sdtfl w16du wp14">
+<w:numbering xmlns:wpc="http://schemas.microsoft.com/office/word/2010/wordprocessingCanvas" xmlns:cx="http://schemas.microsoft.com/office/drawing/2014/chartex" xmlns:cx1="http://schemas.microsoft.com/office/drawing/2015/9/8/chartex" xmlns:cx2="http://schemas.microsoft.com/office/drawing/2015/10/21/chartex" xmlns:cx3="http://schemas.microsoft.com/office/drawing/2016/5/9/chartex" xmlns:cx4="http://schemas.microsoft.com/office/drawing/2016/5/10/chartex" xmlns:cx5="http://schemas.microsoft.com/office/drawing/2016/5/11/chartex" xmlns:cx6="http://schemas.microsoft.com/office/drawing/2016/5/12/chartex" xmlns:cx7="http://schemas.microsoft.com/office/drawing/2016/5/13/chartex" xmlns:cx8="http://schemas.microsoft.com/office/drawing/2016/5/14/chartex" xmlns:mc="http://schemas.openxmlformats.org/markup-compatibility/2006" xmlns:m="http://schemas.openxmlformats.org/officeDocument/2006/math" xmlns:aink="http://schemas.microsoft.com/office/drawing/2016/ink" xmlns:am3d="http://schemas.microsoft.com/office/drawing/2017/model3d" xmlns:oel="http://schemas.microsoft.com/office/2019/extlst" xmlns:r="http://schemas.openxmlformats.org/officeDocument/2006/relationships" xmlns:wp14="http://schemas.microsoft.com/office/word/2010/wordprocessingDrawing" xmlns:wp="http://schemas.openxmlformats.org/drawingml/2006/wordprocessingDrawing" xmlns:wpg="http://schemas.microsoft.com/office/word/2010/wordprocessingGroup" xmlns:wpi="http://schemas.microsoft.com/office/word/2010/wordprocessingInk" xmlns:wps="http://schemas.microsoft.com/office/word/2010/wordprocessingShape" xmlns:o="urn:schemas-microsoft-com:office:office" xmlns:v="urn:schemas-microsoft-com:vml" xmlns:w10="urn:schemas-microsoft-com:office:word" xmlns:w="http://schemas.openxmlformats.org/wordprocessingml/2006/main" xmlns:w14="http://schemas.microsoft.com/office/word/2010/wordml" xmlns:w15="http://schemas.microsoft.com/office/word/2012/wordml" xmlns:w16cex="http://schemas.microsoft.com/office/word/2018/wordml/cex" xmlns:w16cid="http://schemas.microsoft.com/office/word/2016/wordml/cid" xmlns:w16="http://schemas.microsoft.com/office/word/2018/wordml" xmlns:w16sdtdh="http://schemas.microsoft.com/office/word/2020/wordml/sdtdatahash" xmlns:w16sdtfl="http://schemas.microsoft.com/office/word/2024/wordml/sdtformatlock" xmlns:w16se="http://schemas.microsoft.com/office/word/2015/wordml/symex" xmlns:w16du="http://schemas.microsoft.com/office/word/2023/wordml/word16du" xmlns:wne="http://schemas.microsoft.com/office/word/2006/wordml" mc:Ignorable="w14 w15 w16se w16cid w16 w16cex w16sdtdh w16sdtfl w16du wp14">
   <w:abstractNum w:abstractNumId="0" w15:restartNumberingAfterBreak="0">
     <w:nsid w:val="20811E7F"/>
     <w:multiLevelType w:val="multilevel"/>
@@ -10699,7 +10528,7 @@
 </file>
 
 <file path=word/styles.xml><?xml version="1.0" encoding="utf-8"?>
-<w:styles xmlns:mc="http://schemas.openxmlformats.org/markup-compatibility/2006" xmlns:r="http://schemas.openxmlformats.org/officeDocument/2006/relationships" xmlns:w="http://schemas.openxmlformats.org/wordprocessingml/2006/main" xmlns:w14="http://schemas.microsoft.com/office/word/2010/wordml" xmlns:w15="http://schemas.microsoft.com/office/word/2012/wordml" xmlns:w16cex="http://schemas.microsoft.com/office/word/2018/wordml/cex" xmlns:w16cid="http://schemas.microsoft.com/office/word/2016/wordml/cid" xmlns:w16="http://schemas.microsoft.com/office/word/2018/wordml" xmlns:w16du="http://schemas.microsoft.com/office/word/2023/wordml/word16du" xmlns:w16sdtdh="http://schemas.microsoft.com/office/word/2020/wordml/sdtdatahash" xmlns:w16sdtfl="http://schemas.microsoft.com/office/word/2024/wordml/sdtformatlock" xmlns:w16se="http://schemas.microsoft.com/office/word/2015/wordml/symex" mc:Ignorable="w14 w15 w16se w16cid w16 w16cex w16sdtdh w16sdtfl w16du">
+<w:styles xmlns:mc="http://schemas.openxmlformats.org/markup-compatibility/2006" xmlns:r="http://schemas.openxmlformats.org/officeDocument/2006/relationships" xmlns:w="http://schemas.openxmlformats.org/wordprocessingml/2006/main" xmlns:w14="http://schemas.microsoft.com/office/word/2010/wordml" xmlns:w15="http://schemas.microsoft.com/office/word/2012/wordml" xmlns:w16cex="http://schemas.microsoft.com/office/word/2018/wordml/cex" xmlns:w16cid="http://schemas.microsoft.com/office/word/2016/wordml/cid" xmlns:w16="http://schemas.microsoft.com/office/word/2018/wordml" xmlns:w16sdtdh="http://schemas.microsoft.com/office/word/2020/wordml/sdtdatahash" xmlns:w16sdtfl="http://schemas.microsoft.com/office/word/2024/wordml/sdtformatlock" xmlns:w16se="http://schemas.microsoft.com/office/word/2015/wordml/symex" xmlns:w16du="http://schemas.microsoft.com/office/word/2023/wordml/word16du" mc:Ignorable="w14 w15 w16se w16cid w16 w16cex w16sdtdh w16sdtfl w16du">
   <w:docDefaults>
     <w:rPrDefault>
       <w:rPr>

</xml_diff>